<commit_message>
Plateforme AFI : backend Laravel 11 + app mobile Expo offline-first
</commit_message>
<xml_diff>
--- a/Memoire_AFI-DOCS_COMPLET.docx
+++ b/Memoire_AFI-DOCS_COMPLET.docx
@@ -592,7 +592,6 @@
                     <w:t xml:space="preserve"> </w:t>
                   </w:r>
                   <w:proofErr w:type="spellStart"/>
-                  <w:proofErr w:type="gramStart"/>
                   <w:r>
                     <w:rPr>
                       <w:b/>
@@ -612,7 +611,6 @@
                     </w:rPr>
                     <w:t> :</w:t>
                   </w:r>
-                  <w:proofErr w:type="gramEnd"/>
                 </w:p>
                 <w:p>
                   <w:pPr>
@@ -831,17 +829,8 @@
           <w:rFonts w:eastAsia="Times New Roman"/>
           <w:lang w:eastAsia="fr-FR"/>
         </w:rPr>
-        <w:t xml:space="preserve">direction </w:t>
-      </w:r>
-      <w:proofErr w:type="gramStart"/>
-      <w:r>
-        <w:rPr>
-          <w:rFonts w:eastAsia="Times New Roman"/>
-          <w:lang w:eastAsia="fr-FR"/>
-        </w:rPr>
-        <w:t>de :</w:t>
-      </w:r>
-      <w:proofErr w:type="gramEnd"/>
+        <w:t>direction de :</w:t>
+      </w:r>
     </w:p>
     <w:p>
       <w:pPr>
@@ -1006,16 +995,15 @@
           <w:b/>
           <w:lang w:eastAsia="fr-FR"/>
         </w:rPr>
-        <w:t xml:space="preserve"> à AFI-</w:t>
-      </w:r>
-      <w:proofErr w:type="gramStart"/>
+        <w:t xml:space="preserve"> à AFI-L’UE</w:t>
+      </w:r>
       <w:r>
         <w:rPr>
           <w:rFonts w:eastAsia="Times New Roman"/>
           <w:b/>
           <w:lang w:eastAsia="fr-FR"/>
         </w:rPr>
-        <w:t>L’UE</w:t>
+        <w:t>,</w:t>
       </w:r>
       <w:r>
         <w:rPr>
@@ -1023,7 +1011,7 @@
           <w:b/>
           <w:lang w:eastAsia="fr-FR"/>
         </w:rPr>
-        <w:t>,</w:t>
+        <w:t xml:space="preserve">  </w:t>
       </w:r>
       <w:r>
         <w:rPr>
@@ -1031,24 +1019,7 @@
           <w:b/>
           <w:lang w:eastAsia="fr-FR"/>
         </w:rPr>
-        <w:t xml:space="preserve">  </w:t>
-      </w:r>
-      <w:r>
-        <w:rPr>
-          <w:rFonts w:eastAsia="Times New Roman"/>
-          <w:b/>
-          <w:lang w:eastAsia="fr-FR"/>
-        </w:rPr>
-        <w:t>Co</w:t>
-      </w:r>
-      <w:proofErr w:type="gramEnd"/>
-      <w:r>
-        <w:rPr>
-          <w:rFonts w:eastAsia="Times New Roman"/>
-          <w:b/>
-          <w:lang w:eastAsia="fr-FR"/>
-        </w:rPr>
-        <w:t>-</w:t>
+        <w:t>Co-</w:t>
       </w:r>
       <w:proofErr w:type="spellStart"/>
       <w:r>
@@ -1570,15 +1541,7 @@
       </w:r>
       <w:proofErr w:type="spellEnd"/>
       <w:r>
-        <w:t xml:space="preserve">. Merci </w:t>
-      </w:r>
-      <w:proofErr w:type="gramStart"/>
-      <w:r>
-        <w:t>pour</w:t>
-      </w:r>
-      <w:proofErr w:type="gramEnd"/>
-      <w:r>
-        <w:t xml:space="preserve"> </w:t>
+        <w:t xml:space="preserve">. Merci pour </w:t>
       </w:r>
       <w:proofErr w:type="spellStart"/>
       <w:r>
@@ -1925,15 +1888,7 @@
       </w:pPr>
       <w:r>
         <w:br/>
-        <w:t xml:space="preserve">À ma famille, je dis un immense </w:t>
-      </w:r>
-      <w:proofErr w:type="gramStart"/>
-      <w:r>
-        <w:t>merci :</w:t>
-      </w:r>
-      <w:proofErr w:type="gramEnd"/>
-      <w:r>
-        <w:t xml:space="preserve"> À la famille </w:t>
+        <w:t xml:space="preserve">À ma famille, je dis un immense merci : À la famille </w:t>
       </w:r>
       <w:r>
         <w:t>DOUNGOUS</w:t>
@@ -2326,7 +2281,139 @@
         <w:rPr>
           <w:color w:val="000000"/>
         </w:rPr>
-        <w:t xml:space="preserve">La diffusion des ressources pédagogiques au sein des établissements d’enseignement supérieur repose encore fréquemment sur des canaux informels — groupes de messagerie instantanée, échanges de fichiers, courriels — qui entraînent la dispersion des documents, la perte d’information et un accès inégal au savoir. Ce mémoire porte sur la conception et la réalisation d’AFI-DOCS, une plateforme web et mobile destinée à </w:t>
+        <w:t xml:space="preserve">La diffusion des ressources pédagogiques au sein des établissements d’enseignement supérieur repose encore fréquemment sur des </w:t>
+      </w:r>
+      <w:proofErr w:type="spellStart"/>
+      <w:r>
+        <w:rPr>
+          <w:color w:val="000000"/>
+        </w:rPr>
+        <w:t>canaux</w:t>
+      </w:r>
+      <w:proofErr w:type="spellEnd"/>
+      <w:r>
+        <w:rPr>
+          <w:color w:val="000000"/>
+        </w:rPr>
+        <w:t xml:space="preserve"> </w:t>
+      </w:r>
+      <w:proofErr w:type="spellStart"/>
+      <w:r>
+        <w:rPr>
+          <w:color w:val="000000"/>
+        </w:rPr>
+        <w:t>informels</w:t>
+      </w:r>
+      <w:proofErr w:type="spellEnd"/>
+      <w:r>
+        <w:rPr>
+          <w:color w:val="000000"/>
+        </w:rPr>
+        <w:t xml:space="preserve"> (</w:t>
+      </w:r>
+      <w:proofErr w:type="spellStart"/>
+      <w:r>
+        <w:rPr>
+          <w:color w:val="000000"/>
+        </w:rPr>
+        <w:t>groupes</w:t>
+      </w:r>
+      <w:proofErr w:type="spellEnd"/>
+      <w:r>
+        <w:rPr>
+          <w:color w:val="000000"/>
+        </w:rPr>
+        <w:t xml:space="preserve"> de </w:t>
+      </w:r>
+      <w:proofErr w:type="spellStart"/>
+      <w:r>
+        <w:rPr>
+          <w:color w:val="000000"/>
+        </w:rPr>
+        <w:t>messagerie</w:t>
+      </w:r>
+      <w:proofErr w:type="spellEnd"/>
+      <w:r>
+        <w:rPr>
+          <w:color w:val="000000"/>
+        </w:rPr>
+        <w:t xml:space="preserve"> </w:t>
+      </w:r>
+      <w:proofErr w:type="spellStart"/>
+      <w:r>
+        <w:rPr>
+          <w:color w:val="000000"/>
+        </w:rPr>
+        <w:t>instantanée</w:t>
+      </w:r>
+      <w:proofErr w:type="spellEnd"/>
+      <w:r>
+        <w:rPr>
+          <w:color w:val="000000"/>
+        </w:rPr>
+        <w:t xml:space="preserve">, </w:t>
+      </w:r>
+      <w:proofErr w:type="spellStart"/>
+      <w:r>
+        <w:rPr>
+          <w:color w:val="000000"/>
+        </w:rPr>
+        <w:t>échanges</w:t>
+      </w:r>
+      <w:proofErr w:type="spellEnd"/>
+      <w:r>
+        <w:rPr>
+          <w:color w:val="000000"/>
+        </w:rPr>
+        <w:t xml:space="preserve"> de </w:t>
+      </w:r>
+      <w:proofErr w:type="spellStart"/>
+      <w:r>
+        <w:rPr>
+          <w:color w:val="000000"/>
+        </w:rPr>
+        <w:t>fichiers</w:t>
+      </w:r>
+      <w:proofErr w:type="spellEnd"/>
+      <w:r>
+        <w:rPr>
+          <w:color w:val="000000"/>
+        </w:rPr>
+        <w:t xml:space="preserve">, </w:t>
+      </w:r>
+      <w:proofErr w:type="spellStart"/>
+      <w:r>
+        <w:rPr>
+          <w:color w:val="000000"/>
+        </w:rPr>
+        <w:t>courriels</w:t>
+      </w:r>
+      <w:proofErr w:type="spellEnd"/>
+      <w:r>
+        <w:rPr>
+          <w:color w:val="000000"/>
+        </w:rPr>
+        <w:t xml:space="preserve">) </w:t>
+      </w:r>
+      <w:r>
+        <w:rPr>
+          <w:color w:val="000000"/>
+        </w:rPr>
+        <w:t xml:space="preserve">qui </w:t>
+      </w:r>
+      <w:proofErr w:type="spellStart"/>
+      <w:r>
+        <w:rPr>
+          <w:color w:val="000000"/>
+        </w:rPr>
+        <w:t>entraînent</w:t>
+      </w:r>
+      <w:proofErr w:type="spellEnd"/>
+      <w:r>
+        <w:rPr>
+          <w:color w:val="000000"/>
+        </w:rPr>
+        <w:t xml:space="preserve"> la dispersion des documents, la perte d’information et un accès inégal au savoir. Ce mémoire porte sur la conception et la réalisation d’AFI-DOCS, une plateforme web et mobile destinée à </w:t>
       </w:r>
       <w:r>
         <w:rPr>
@@ -2365,7 +2452,205 @@
         <w:rPr>
           <w:color w:val="000000"/>
         </w:rPr>
-        <w:t>La démarche associe une revue conceptuelle et critique (systèmes de gestion de l’apprentissage, plateformes collaboratives, architectures REST, approche offline-first), une modélisation UML, un développement itératif selon la méthode Agile Scrum, une enquête par questionnaire auprès de la communauté AFI (six réponses) et une campagne de tests fonctionnels sur la plateforme déployée. Les résultats montrent qu’AFI-DOCS répond aux défaillances identifiées : centralisation pérenne, classification hiérarchique (filière, niveau, matière, semestre, année), accès restreint et pertinent selon la filière et le niveau, et disponibilité hors connexion. Des fonctionnalités additionnelles — sécurité renforcée, notifications, espaces d’échange, évaluation des enseignants — renforcent cette finalité sans s’y substituer.</w:t>
+        <w:t xml:space="preserve">La démarche associe une revue conceptuelle et critique (systèmes de gestion de l’apprentissage, plateformes collaboratives, architectures REST, approche offline-first), une modélisation UML, un développement itératif selon la méthode Agile Scrum, une enquête par questionnaire auprès de la </w:t>
+      </w:r>
+      <w:proofErr w:type="spellStart"/>
+      <w:r>
+        <w:rPr>
+          <w:color w:val="000000"/>
+        </w:rPr>
+        <w:t>communauté</w:t>
+      </w:r>
+      <w:proofErr w:type="spellEnd"/>
+      <w:r>
+        <w:rPr>
+          <w:color w:val="000000"/>
+        </w:rPr>
+        <w:t xml:space="preserve"> AFI et </w:t>
+      </w:r>
+      <w:proofErr w:type="spellStart"/>
+      <w:r>
+        <w:rPr>
+          <w:color w:val="000000"/>
+        </w:rPr>
+        <w:t>une</w:t>
+      </w:r>
+      <w:proofErr w:type="spellEnd"/>
+      <w:r>
+        <w:rPr>
+          <w:color w:val="000000"/>
+        </w:rPr>
+        <w:t xml:space="preserve"> </w:t>
+      </w:r>
+      <w:proofErr w:type="spellStart"/>
+      <w:r>
+        <w:rPr>
+          <w:color w:val="000000"/>
+        </w:rPr>
+        <w:t>campagne</w:t>
+      </w:r>
+      <w:proofErr w:type="spellEnd"/>
+      <w:r>
+        <w:rPr>
+          <w:color w:val="000000"/>
+        </w:rPr>
+        <w:t xml:space="preserve"> de tests fonctionnels sur la plateforme déployée. Les résultats montrent qu’AFI-DOCS répond aux défaillances identifiées : centralisation pérenne, classification hiérarchique (filière, niveau, matière, semestre, année), accès restreint et pertinent selon la filière et le niveau, et disponibilité hors connexion. Des </w:t>
+      </w:r>
+      <w:proofErr w:type="spellStart"/>
+      <w:r>
+        <w:rPr>
+          <w:color w:val="000000"/>
+        </w:rPr>
+        <w:t>fonctionnalités</w:t>
+      </w:r>
+      <w:proofErr w:type="spellEnd"/>
+      <w:r>
+        <w:rPr>
+          <w:color w:val="000000"/>
+        </w:rPr>
+        <w:t xml:space="preserve"> </w:t>
+      </w:r>
+      <w:proofErr w:type="spellStart"/>
+      <w:r>
+        <w:rPr>
+          <w:color w:val="000000"/>
+        </w:rPr>
+        <w:t>additionnelles</w:t>
+      </w:r>
+      <w:proofErr w:type="spellEnd"/>
+      <w:r>
+        <w:rPr>
+          <w:color w:val="000000"/>
+        </w:rPr>
+        <w:t xml:space="preserve"> </w:t>
+      </w:r>
+      <w:proofErr w:type="spellStart"/>
+      <w:r>
+        <w:rPr>
+          <w:color w:val="000000"/>
+        </w:rPr>
+        <w:t>telles</w:t>
+      </w:r>
+      <w:proofErr w:type="spellEnd"/>
+      <w:r>
+        <w:rPr>
+          <w:color w:val="000000"/>
+        </w:rPr>
+        <w:t xml:space="preserve"> </w:t>
+      </w:r>
+      <w:proofErr w:type="spellStart"/>
+      <w:r>
+        <w:rPr>
+          <w:color w:val="000000"/>
+        </w:rPr>
+        <w:t>que</w:t>
+      </w:r>
+      <w:proofErr w:type="spellEnd"/>
+      <w:r>
+        <w:rPr>
+          <w:color w:val="000000"/>
+        </w:rPr>
+        <w:t>: la</w:t>
+      </w:r>
+      <w:r>
+        <w:rPr>
+          <w:color w:val="000000"/>
+        </w:rPr>
+        <w:t xml:space="preserve"> sécurité </w:t>
+      </w:r>
+      <w:proofErr w:type="spellStart"/>
+      <w:r>
+        <w:rPr>
+          <w:color w:val="000000"/>
+        </w:rPr>
+        <w:t>renforcée</w:t>
+      </w:r>
+      <w:proofErr w:type="spellEnd"/>
+      <w:r>
+        <w:rPr>
+          <w:color w:val="000000"/>
+        </w:rPr>
+        <w:t xml:space="preserve">, </w:t>
+      </w:r>
+      <w:r>
+        <w:rPr>
+          <w:color w:val="000000"/>
+        </w:rPr>
+        <w:t xml:space="preserve">les </w:t>
+      </w:r>
+      <w:r>
+        <w:rPr>
+          <w:color w:val="000000"/>
+        </w:rPr>
+        <w:t xml:space="preserve">notifications, </w:t>
+      </w:r>
+      <w:r>
+        <w:rPr>
+          <w:color w:val="000000"/>
+        </w:rPr>
+        <w:t xml:space="preserve">Des </w:t>
+      </w:r>
+      <w:proofErr w:type="spellStart"/>
+      <w:r>
+        <w:rPr>
+          <w:color w:val="000000"/>
+        </w:rPr>
+        <w:t>espaces</w:t>
+      </w:r>
+      <w:proofErr w:type="spellEnd"/>
+      <w:r>
+        <w:rPr>
+          <w:color w:val="000000"/>
+        </w:rPr>
+        <w:t xml:space="preserve"> </w:t>
+      </w:r>
+      <w:proofErr w:type="spellStart"/>
+      <w:r>
+        <w:rPr>
+          <w:color w:val="000000"/>
+        </w:rPr>
+        <w:t>d’échange</w:t>
+      </w:r>
+      <w:proofErr w:type="spellEnd"/>
+      <w:r>
+        <w:rPr>
+          <w:color w:val="000000"/>
+        </w:rPr>
+        <w:t xml:space="preserve">, </w:t>
+      </w:r>
+      <w:proofErr w:type="spellStart"/>
+      <w:r>
+        <w:rPr>
+          <w:color w:val="000000"/>
+        </w:rPr>
+        <w:t>l’</w:t>
+      </w:r>
+      <w:r>
+        <w:rPr>
+          <w:color w:val="000000"/>
+        </w:rPr>
+        <w:t>évaluation</w:t>
+      </w:r>
+      <w:proofErr w:type="spellEnd"/>
+      <w:r>
+        <w:rPr>
+          <w:color w:val="000000"/>
+        </w:rPr>
+        <w:t xml:space="preserve"> des </w:t>
+      </w:r>
+      <w:proofErr w:type="spellStart"/>
+      <w:r>
+        <w:rPr>
+          <w:color w:val="000000"/>
+        </w:rPr>
+        <w:t>enseignants</w:t>
+      </w:r>
+      <w:proofErr w:type="spellEnd"/>
+      <w:r>
+        <w:rPr>
+          <w:color w:val="000000"/>
+        </w:rPr>
+        <w:t xml:space="preserve">. </w:t>
       </w:r>
     </w:p>
     <w:p>

</xml_diff>